<commit_message>
Update final approve UI implementation documents
</commit_message>
<xml_diff>
--- a/docs/implementation-code/front-end/WF-002_Participant_Authentication_Login_UI_Implementation_v1.3.docx
+++ b/docs/implementation-code/front-end/WF-002_Participant_Authentication_Login_UI_Implementation_v1.3.docx
@@ -4692,7 +4692,7 @@
                 <w:rFonts w:ascii="Arial" w:hAnsi="Arial"/>
                 <w:sz w:val="16"/>
               </w:rPr>
-              <w:t>UI Wireframe v1.2</w:t>
+              <w:t>UI Wireframe v1.3</w:t>
             </w:r>
           </w:p>
         </w:tc>
@@ -5145,7 +5145,7 @@
           </w:tcPr>
           <w:p>
             <w:r>
-              <w:t>CLOSED - review recommendations applied without changing approved business/API/security/persistence semantics. Repository integration and test execution remain pending; WF-003/WF-005 controlled Username blockers remain unresolved by design.</w:t>
+              <w:t>CLOSED - v1.2 review recommendations were applied without changing approved business/API/security/persistence semantics. At v1.2, the WF-003/WF-005 Username blockers remained unresolved; those blockers are superseded and closed by the approved v1.3 source baseline. Repository integration and test execution remain pending.</w:t>
             </w:r>
           </w:p>
         </w:tc>

</xml_diff>